<commit_message>
Updating tooling to start using newer authentication methods (Client Credentials)
</commit_message>
<xml_diff>
--- a/Documentation/DAM Config Mover Tool Guide.docx
+++ b/Documentation/DAM Config Mover Tool Guide.docx
@@ -22,6 +22,14 @@
       </w:r>
     </w:p>
     <w:p/>
+    <w:p>
+      <w:pPr>
+        <w:pStyle w:val="Heading1"/>
+      </w:pPr>
+      <w:r>
+        <w:t>Overview</w:t>
+      </w:r>
+    </w:p>
     <w:p/>
     <w:p>
       <w:r>
@@ -44,7 +52,7 @@
         <mc:AlternateContent>
           <mc:Choice Requires="wps">
             <w:drawing>
-              <wp:anchor distT="0" distB="0" distL="114300" distR="114300" simplePos="0" relativeHeight="251663360" behindDoc="0" locked="0" layoutInCell="1" allowOverlap="1" wp14:anchorId="38424125" wp14:editId="60CA09FF">
+              <wp:anchor distT="0" distB="0" distL="114300" distR="114300" simplePos="0" relativeHeight="251663360" behindDoc="0" locked="0" layoutInCell="1" allowOverlap="1" wp14:anchorId="7D82EA10" wp14:editId="225A507D">
                 <wp:simplePos x="0" y="0"/>
                 <wp:positionH relativeFrom="leftMargin">
                   <wp:posOffset>4037992</wp:posOffset>
@@ -134,7 +142,7 @@
           </mc:Choice>
           <mc:Fallback>
             <w:pict>
-              <v:roundrect w14:anchorId="38424125" id="Rectangle: Rounded Corners 8" o:spid="_x0000_s1026" style="position:absolute;margin-left:317.95pt;margin-top:3.65pt;width:139.6pt;height:17.55pt;z-index:251663360;visibility:visible;mso-wrap-style:square;mso-width-percent:0;mso-height-percent:0;mso-wrap-distance-left:9pt;mso-wrap-distance-top:0;mso-wrap-distance-right:9pt;mso-wrap-distance-bottom:0;mso-position-horizontal:absolute;mso-position-horizontal-relative:left-margin-area;mso-position-vertical:absolute;mso-position-vertical-relative:text;mso-width-percent:0;mso-height-percent:0;mso-width-relative:margin;mso-height-relative:margin;v-text-anchor:middle" arcsize="10923f" o:gfxdata="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" fillcolor="#4472c4 [3204]" strokecolor="#4472c4 [3204]" strokeweight="1pt">
+              <v:roundrect w14:anchorId="7D82EA10" id="Rectangle: Rounded Corners 8" o:spid="_x0000_s1026" style="position:absolute;margin-left:317.95pt;margin-top:3.65pt;width:139.6pt;height:17.55pt;z-index:251663360;visibility:visible;mso-wrap-style:square;mso-width-percent:0;mso-height-percent:0;mso-wrap-distance-left:9pt;mso-wrap-distance-top:0;mso-wrap-distance-right:9pt;mso-wrap-distance-bottom:0;mso-position-horizontal:absolute;mso-position-horizontal-relative:left-margin-area;mso-position-vertical:absolute;mso-position-vertical-relative:text;mso-width-percent:0;mso-height-percent:0;mso-width-relative:margin;mso-height-relative:margin;v-text-anchor:middle" arcsize="10923f" o:gfxdata="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" fillcolor="#4472c4 [3204]" strokecolor="#4472c4 [3204]" strokeweight="1pt">
                 <v:stroke joinstyle="miter"/>
                 <v:textbox>
                   <w:txbxContent>
@@ -169,7 +177,7 @@
         <mc:AlternateContent>
           <mc:Choice Requires="wps">
             <w:drawing>
-              <wp:anchor distT="0" distB="0" distL="114300" distR="114300" simplePos="0" relativeHeight="251667456" behindDoc="0" locked="0" layoutInCell="1" allowOverlap="1" wp14:anchorId="41EE6882" wp14:editId="722C1A24">
+              <wp:anchor distT="0" distB="0" distL="114300" distR="114300" simplePos="0" relativeHeight="251667456" behindDoc="0" locked="0" layoutInCell="1" allowOverlap="1" wp14:anchorId="7DCE9BCE" wp14:editId="7A3C2A37">
                 <wp:simplePos x="0" y="0"/>
                 <wp:positionH relativeFrom="leftMargin">
                   <wp:posOffset>1534602</wp:posOffset>
@@ -259,7 +267,7 @@
           </mc:Choice>
           <mc:Fallback>
             <w:pict>
-              <v:roundrect w14:anchorId="41EE6882" id="Rectangle: Rounded Corners 15" o:spid="_x0000_s1027" style="position:absolute;margin-left:120.85pt;margin-top:1.9pt;width:157.75pt;height:17.5pt;z-index:251667456;visibility:visible;mso-wrap-style:square;mso-width-percent:0;mso-height-percent:0;mso-wrap-distance-left:9pt;mso-wrap-distance-top:0;mso-wrap-distance-right:9pt;mso-wrap-distance-bottom:0;mso-position-horizontal:absolute;mso-position-horizontal-relative:left-margin-area;mso-position-vertical:absolute;mso-position-vertical-relative:text;mso-width-percent:0;mso-height-percent:0;mso-width-relative:margin;mso-height-relative:margin;v-text-anchor:middle" arcsize="10923f" o:gfxdata="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" fillcolor="#4472c4 [3204]" strokecolor="#4472c4 [3204]" strokeweight="1pt">
+              <v:roundrect w14:anchorId="7DCE9BCE" id="Rectangle: Rounded Corners 15" o:spid="_x0000_s1027" style="position:absolute;margin-left:120.85pt;margin-top:1.9pt;width:157.75pt;height:17.5pt;z-index:251667456;visibility:visible;mso-wrap-style:square;mso-width-percent:0;mso-height-percent:0;mso-wrap-distance-left:9pt;mso-wrap-distance-top:0;mso-wrap-distance-right:9pt;mso-wrap-distance-bottom:0;mso-position-horizontal:absolute;mso-position-horizontal-relative:left-margin-area;mso-position-vertical:absolute;mso-position-vertical-relative:text;mso-width-percent:0;mso-height-percent:0;mso-width-relative:margin;mso-height-relative:margin;v-text-anchor:middle" arcsize="10923f" o:gfxdata="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" fillcolor="#4472c4 [3204]" strokecolor="#4472c4 [3204]" strokeweight="1pt">
                 <v:stroke joinstyle="miter"/>
                 <v:textbox>
                   <w:txbxContent>
@@ -294,7 +302,7 @@
         <mc:AlternateContent>
           <mc:Choice Requires="wps">
             <w:drawing>
-              <wp:anchor distT="0" distB="0" distL="114300" distR="114300" simplePos="0" relativeHeight="251668480" behindDoc="0" locked="0" layoutInCell="1" allowOverlap="1" wp14:anchorId="20F3CBE5" wp14:editId="43E1CA90">
+              <wp:anchor distT="0" distB="0" distL="114300" distR="114300" simplePos="0" relativeHeight="251668480" behindDoc="0" locked="0" layoutInCell="1" allowOverlap="1" wp14:anchorId="712C6DE6" wp14:editId="5080FC60">
                 <wp:simplePos x="0" y="0"/>
                 <wp:positionH relativeFrom="column">
                   <wp:posOffset>1876507</wp:posOffset>
@@ -352,7 +360,7 @@
           </mc:Choice>
           <mc:Fallback>
             <w:pict>
-              <v:shapetype w14:anchorId="7132C20B" id="_x0000_t32" coordsize="21600,21600" o:spt="32" o:oned="t" path="m,l21600,21600e" filled="f">
+              <v:shapetype w14:anchorId="7C743A11" id="_x0000_t32" coordsize="21600,21600" o:spt="32" o:oned="t" path="m,l21600,21600e" filled="f">
                 <v:path arrowok="t" fillok="f" o:connecttype="none"/>
                 <o:lock v:ext="edit" shapetype="t"/>
               </v:shapetype>
@@ -370,7 +378,7 @@
         <mc:AlternateContent>
           <mc:Choice Requires="wps">
             <w:drawing>
-              <wp:anchor distT="0" distB="0" distL="114300" distR="114300" simplePos="0" relativeHeight="251660288" behindDoc="0" locked="0" layoutInCell="1" allowOverlap="1" wp14:anchorId="4824BCE5" wp14:editId="446F7B14">
+              <wp:anchor distT="0" distB="0" distL="114300" distR="114300" simplePos="0" relativeHeight="251660288" behindDoc="0" locked="0" layoutInCell="1" allowOverlap="1" wp14:anchorId="7F5ED765" wp14:editId="747A4CCD">
                 <wp:simplePos x="0" y="0"/>
                 <wp:positionH relativeFrom="column">
                   <wp:posOffset>2900570</wp:posOffset>
@@ -428,7 +436,7 @@
           </mc:Choice>
           <mc:Fallback>
             <w:pict>
-              <v:shape w14:anchorId="20D59278" id="Straight Arrow Connector 5" o:spid="_x0000_s1026" type="#_x0000_t32" style="position:absolute;margin-left:228.4pt;margin-top:15.05pt;width:57.75pt;height:108.3pt;flip:x;z-index:251660288;visibility:visible;mso-wrap-style:square;mso-width-percent:0;mso-height-percent:0;mso-wrap-distance-left:9pt;mso-wrap-distance-top:0;mso-wrap-distance-right:9pt;mso-wrap-distance-bottom:0;mso-position-horizontal:absolute;mso-position-horizontal-relative:text;mso-position-vertical:absolute;mso-position-vertical-relative:text;mso-width-percent:0;mso-height-percent:0;mso-width-relative:margin;mso-height-relative:margin" o:gfxdata="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" strokecolor="#4472c4 [3204]" strokeweight=".5pt">
+              <v:shape w14:anchorId="6528C6E2" id="Straight Arrow Connector 5" o:spid="_x0000_s1026" type="#_x0000_t32" style="position:absolute;margin-left:228.4pt;margin-top:15.05pt;width:57.75pt;height:108.3pt;flip:x;z-index:251660288;visibility:visible;mso-wrap-style:square;mso-width-percent:0;mso-height-percent:0;mso-wrap-distance-left:9pt;mso-wrap-distance-top:0;mso-wrap-distance-right:9pt;mso-wrap-distance-bottom:0;mso-position-horizontal:absolute;mso-position-horizontal-relative:text;mso-position-vertical:absolute;mso-position-vertical-relative:text;mso-width-percent:0;mso-height-percent:0;mso-width-relative:margin;mso-height-relative:margin" o:gfxdata="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" strokecolor="#4472c4 [3204]" strokeweight=".5pt">
                 <v:stroke endarrow="block" joinstyle="miter"/>
               </v:shape>
             </w:pict>
@@ -447,7 +455,7 @@
         <mc:AlternateContent>
           <mc:Choice Requires="wps">
             <w:drawing>
-              <wp:anchor distT="0" distB="0" distL="114300" distR="114300" simplePos="0" relativeHeight="251672576" behindDoc="0" locked="0" layoutInCell="1" allowOverlap="1" wp14:anchorId="03D17899" wp14:editId="160C4041">
+              <wp:anchor distT="0" distB="0" distL="114300" distR="114300" simplePos="0" relativeHeight="251672576" behindDoc="0" locked="0" layoutInCell="1" allowOverlap="1" wp14:anchorId="12E15248" wp14:editId="691E46BB">
                 <wp:simplePos x="0" y="0"/>
                 <wp:positionH relativeFrom="column">
                   <wp:posOffset>3085105</wp:posOffset>
@@ -505,7 +513,7 @@
           </mc:Choice>
           <mc:Fallback>
             <w:pict>
-              <v:shape w14:anchorId="267C9CBA" id="Straight Arrow Connector 4" o:spid="_x0000_s1026" type="#_x0000_t32" style="position:absolute;margin-left:242.9pt;margin-top:187.95pt;width:63.7pt;height:137.6pt;flip:x y;z-index:251672576;visibility:visible;mso-wrap-style:square;mso-width-percent:0;mso-height-percent:0;mso-wrap-distance-left:9pt;mso-wrap-distance-top:0;mso-wrap-distance-right:9pt;mso-wrap-distance-bottom:0;mso-position-horizontal:absolute;mso-position-horizontal-relative:text;mso-position-vertical:absolute;mso-position-vertical-relative:text;mso-width-percent:0;mso-height-percent:0;mso-width-relative:margin;mso-height-relative:margin" o:gfxdata="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" strokecolor="#4472c4 [3204]" strokeweight=".5pt">
+              <v:shape w14:anchorId="7973F552" id="Straight Arrow Connector 4" o:spid="_x0000_s1026" type="#_x0000_t32" style="position:absolute;margin-left:242.9pt;margin-top:187.95pt;width:63.7pt;height:137.6pt;flip:x y;z-index:251672576;visibility:visible;mso-wrap-style:square;mso-width-percent:0;mso-height-percent:0;mso-wrap-distance-left:9pt;mso-wrap-distance-top:0;mso-wrap-distance-right:9pt;mso-wrap-distance-bottom:0;mso-position-horizontal:absolute;mso-position-horizontal-relative:text;mso-position-vertical:absolute;mso-position-vertical-relative:text;mso-width-percent:0;mso-height-percent:0;mso-width-relative:margin;mso-height-relative:margin" o:gfxdata="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" strokecolor="#4472c4 [3204]" strokeweight=".5pt">
                 <v:stroke endarrow="block" joinstyle="miter"/>
               </v:shape>
             </w:pict>
@@ -519,7 +527,7 @@
         <mc:AlternateContent>
           <mc:Choice Requires="wps">
             <w:drawing>
-              <wp:anchor distT="0" distB="0" distL="114300" distR="114300" simplePos="0" relativeHeight="251670528" behindDoc="0" locked="0" layoutInCell="1" allowOverlap="1" wp14:anchorId="6F09B9B4" wp14:editId="63262227">
+              <wp:anchor distT="0" distB="0" distL="114300" distR="114300" simplePos="0" relativeHeight="251670528" behindDoc="0" locked="0" layoutInCell="1" allowOverlap="1" wp14:anchorId="498C6513" wp14:editId="2A0E6E62">
                 <wp:simplePos x="0" y="0"/>
                 <wp:positionH relativeFrom="column">
                   <wp:posOffset>754932</wp:posOffset>
@@ -577,7 +585,7 @@
           </mc:Choice>
           <mc:Fallback>
             <w:pict>
-              <v:shape w14:anchorId="235827D8" id="Straight Arrow Connector 18" o:spid="_x0000_s1026" type="#_x0000_t32" style="position:absolute;margin-left:59.45pt;margin-top:298.1pt;width:51.95pt;height:24.4pt;flip:x y;z-index:251670528;visibility:visible;mso-wrap-style:square;mso-width-percent:0;mso-height-percent:0;mso-wrap-distance-left:9pt;mso-wrap-distance-top:0;mso-wrap-distance-right:9pt;mso-wrap-distance-bottom:0;mso-position-horizontal:absolute;mso-position-horizontal-relative:text;mso-position-vertical:absolute;mso-position-vertical-relative:text;mso-width-percent:0;mso-height-percent:0;mso-width-relative:margin;mso-height-relative:margin" o:gfxdata="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" strokecolor="#4472c4 [3204]" strokeweight=".5pt">
+              <v:shape w14:anchorId="3BD3CE98" id="Straight Arrow Connector 18" o:spid="_x0000_s1026" type="#_x0000_t32" style="position:absolute;margin-left:59.45pt;margin-top:298.1pt;width:51.95pt;height:24.4pt;flip:x y;z-index:251670528;visibility:visible;mso-wrap-style:square;mso-width-percent:0;mso-height-percent:0;mso-wrap-distance-left:9pt;mso-wrap-distance-top:0;mso-wrap-distance-right:9pt;mso-wrap-distance-bottom:0;mso-position-horizontal:absolute;mso-position-horizontal-relative:text;mso-position-vertical:absolute;mso-position-vertical-relative:text;mso-width-percent:0;mso-height-percent:0;mso-width-relative:margin;mso-height-relative:margin" o:gfxdata="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" strokecolor="#4472c4 [3204]" strokeweight=".5pt">
                 <v:stroke endarrow="block" joinstyle="miter"/>
               </v:shape>
             </w:pict>
@@ -591,7 +599,7 @@
         <mc:AlternateContent>
           <mc:Choice Requires="wps">
             <w:drawing>
-              <wp:anchor distT="0" distB="0" distL="114300" distR="114300" simplePos="0" relativeHeight="251666432" behindDoc="0" locked="0" layoutInCell="1" allowOverlap="1" wp14:anchorId="48F9246F" wp14:editId="18F7903E">
+              <wp:anchor distT="0" distB="0" distL="114300" distR="114300" simplePos="0" relativeHeight="251666432" behindDoc="0" locked="0" layoutInCell="1" allowOverlap="1" wp14:anchorId="06AD6F56" wp14:editId="4694DF87">
                 <wp:simplePos x="0" y="0"/>
                 <wp:positionH relativeFrom="rightMargin">
                   <wp:align>left</wp:align>
@@ -681,7 +689,7 @@
           </mc:Choice>
           <mc:Fallback>
             <w:pict>
-              <v:roundrect w14:anchorId="48F9246F" id="Rectangle: Rounded Corners 11" o:spid="_x0000_s1028" style="position:absolute;margin-left:0;margin-top:56.45pt;width:46.95pt;height:45.55pt;z-index:251666432;visibility:visible;mso-wrap-style:square;mso-width-percent:0;mso-height-percent:0;mso-wrap-distance-left:9pt;mso-wrap-distance-top:0;mso-wrap-distance-right:9pt;mso-wrap-distance-bottom:0;mso-position-horizontal:left;mso-position-horizontal-relative:right-margin-area;mso-position-vertical:absolute;mso-position-vertical-relative:text;mso-width-percent:0;mso-height-percent:0;mso-width-relative:margin;mso-height-relative:margin;v-text-anchor:middle" arcsize="10923f" o:gfxdata="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" fillcolor="#4472c4 [3204]" strokecolor="#4472c4 [3204]" strokeweight="1pt">
+              <v:roundrect w14:anchorId="06AD6F56" id="Rectangle: Rounded Corners 11" o:spid="_x0000_s1028" style="position:absolute;margin-left:0;margin-top:56.45pt;width:46.95pt;height:45.55pt;z-index:251666432;visibility:visible;mso-wrap-style:square;mso-width-percent:0;mso-height-percent:0;mso-wrap-distance-left:9pt;mso-wrap-distance-top:0;mso-wrap-distance-right:9pt;mso-wrap-distance-bottom:0;mso-position-horizontal:left;mso-position-horizontal-relative:right-margin-area;mso-position-vertical:absolute;mso-position-vertical-relative:text;mso-width-percent:0;mso-height-percent:0;mso-width-relative:margin;mso-height-relative:margin;v-text-anchor:middle" arcsize="10923f" o:gfxdata="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" fillcolor="#4472c4 [3204]" strokecolor="#4472c4 [3204]" strokeweight="1pt">
                 <v:stroke joinstyle="miter"/>
                 <v:textbox>
                   <w:txbxContent>
@@ -716,7 +724,7 @@
         <mc:AlternateContent>
           <mc:Choice Requires="wps">
             <w:drawing>
-              <wp:anchor distT="0" distB="0" distL="114300" distR="114300" simplePos="0" relativeHeight="251665408" behindDoc="0" locked="0" layoutInCell="1" allowOverlap="1" wp14:anchorId="6C654CCC" wp14:editId="054029BF">
+              <wp:anchor distT="0" distB="0" distL="114300" distR="114300" simplePos="0" relativeHeight="251665408" behindDoc="0" locked="0" layoutInCell="1" allowOverlap="1" wp14:anchorId="58501B1A" wp14:editId="142CA537">
                 <wp:simplePos x="0" y="0"/>
                 <wp:positionH relativeFrom="column">
                   <wp:posOffset>4689612</wp:posOffset>
@@ -774,7 +782,7 @@
           </mc:Choice>
           <mc:Fallback>
             <w:pict>
-              <v:shape w14:anchorId="35978CCE" id="Straight Arrow Connector 10" o:spid="_x0000_s1026" type="#_x0000_t32" style="position:absolute;margin-left:369.25pt;margin-top:90.15pt;width:107.15pt;height:66.95pt;flip:x;z-index:251665408;visibility:visible;mso-wrap-style:square;mso-width-percent:0;mso-height-percent:0;mso-wrap-distance-left:9pt;mso-wrap-distance-top:0;mso-wrap-distance-right:9pt;mso-wrap-distance-bottom:0;mso-position-horizontal:absolute;mso-position-horizontal-relative:text;mso-position-vertical:absolute;mso-position-vertical-relative:text;mso-width-percent:0;mso-height-percent:0;mso-width-relative:margin;mso-height-relative:margin" o:gfxdata="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" strokecolor="#4472c4 [3204]" strokeweight=".5pt">
+              <v:shape w14:anchorId="22B6A5A1" id="Straight Arrow Connector 10" o:spid="_x0000_s1026" type="#_x0000_t32" style="position:absolute;margin-left:369.25pt;margin-top:90.15pt;width:107.15pt;height:66.95pt;flip:x;z-index:251665408;visibility:visible;mso-wrap-style:square;mso-width-percent:0;mso-height-percent:0;mso-wrap-distance-left:9pt;mso-wrap-distance-top:0;mso-wrap-distance-right:9pt;mso-wrap-distance-bottom:0;mso-position-horizontal:absolute;mso-position-horizontal-relative:text;mso-position-vertical:absolute;mso-position-vertical-relative:text;mso-width-percent:0;mso-height-percent:0;mso-width-relative:margin;mso-height-relative:margin" o:gfxdata="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" strokecolor="#4472c4 [3204]" strokeweight=".5pt">
                 <v:stroke endarrow="block" joinstyle="miter"/>
               </v:shape>
             </w:pict>
@@ -788,7 +796,7 @@
         <mc:AlternateContent>
           <mc:Choice Requires="wps">
             <w:drawing>
-              <wp:anchor distT="0" distB="0" distL="114300" distR="114300" simplePos="0" relativeHeight="251664384" behindDoc="0" locked="0" layoutInCell="1" allowOverlap="1" wp14:anchorId="098E2CC7" wp14:editId="2E587E19">
+              <wp:anchor distT="0" distB="0" distL="114300" distR="114300" simplePos="0" relativeHeight="251664384" behindDoc="0" locked="0" layoutInCell="1" allowOverlap="1" wp14:anchorId="0FCAF09F" wp14:editId="777DBBBB">
                 <wp:simplePos x="0" y="0"/>
                 <wp:positionH relativeFrom="column">
                   <wp:posOffset>4490829</wp:posOffset>
@@ -846,7 +854,7 @@
           </mc:Choice>
           <mc:Fallback>
             <w:pict>
-              <v:shape w14:anchorId="5EB98BAB" id="Straight Arrow Connector 9" o:spid="_x0000_s1026" type="#_x0000_t32" style="position:absolute;margin-left:353.6pt;margin-top:19.3pt;width:122.85pt;height:53.35pt;flip:x y;z-index:251664384;visibility:visible;mso-wrap-style:square;mso-width-percent:0;mso-height-percent:0;mso-wrap-distance-left:9pt;mso-wrap-distance-top:0;mso-wrap-distance-right:9pt;mso-wrap-distance-bottom:0;mso-position-horizontal:absolute;mso-position-horizontal-relative:text;mso-position-vertical:absolute;mso-position-vertical-relative:text;mso-width-percent:0;mso-height-percent:0;mso-width-relative:margin;mso-height-relative:margin" o:gfxdata="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" strokecolor="#4472c4 [3204]" strokeweight=".5pt">
+              <v:shape w14:anchorId="2E636590" id="Straight Arrow Connector 9" o:spid="_x0000_s1026" type="#_x0000_t32" style="position:absolute;margin-left:353.6pt;margin-top:19.3pt;width:122.85pt;height:53.35pt;flip:x y;z-index:251664384;visibility:visible;mso-wrap-style:square;mso-width-percent:0;mso-height-percent:0;mso-wrap-distance-left:9pt;mso-wrap-distance-top:0;mso-wrap-distance-right:9pt;mso-wrap-distance-bottom:0;mso-position-horizontal:absolute;mso-position-horizontal-relative:text;mso-position-vertical:absolute;mso-position-vertical-relative:text;mso-width-percent:0;mso-height-percent:0;mso-width-relative:margin;mso-height-relative:margin" o:gfxdata="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" strokecolor="#4472c4 [3204]" strokeweight=".5pt">
                 <v:stroke endarrow="block" joinstyle="miter"/>
               </v:shape>
             </w:pict>
@@ -860,7 +868,7 @@
         <mc:AlternateContent>
           <mc:Choice Requires="wps">
             <w:drawing>
-              <wp:anchor distT="0" distB="0" distL="114300" distR="114300" simplePos="0" relativeHeight="251662336" behindDoc="0" locked="0" layoutInCell="1" allowOverlap="1" wp14:anchorId="13EA5A94" wp14:editId="20A19CE9">
+              <wp:anchor distT="0" distB="0" distL="114300" distR="114300" simplePos="0" relativeHeight="251662336" behindDoc="0" locked="0" layoutInCell="1" allowOverlap="1" wp14:anchorId="2D97E913" wp14:editId="37D5465C">
                 <wp:simplePos x="0" y="0"/>
                 <wp:positionH relativeFrom="leftMargin">
                   <wp:align>right</wp:align>
@@ -964,7 +972,7 @@
           </mc:Choice>
           <mc:Fallback>
             <w:pict>
-              <v:roundrect w14:anchorId="13EA5A94" id="Rectangle: Rounded Corners 7" o:spid="_x0000_s1029" style="position:absolute;margin-left:-1.75pt;margin-top:127.75pt;width:49.45pt;height:67.6pt;z-index:251662336;visibility:visible;mso-wrap-style:square;mso-width-percent:0;mso-height-percent:0;mso-wrap-distance-left:9pt;mso-wrap-distance-top:0;mso-wrap-distance-right:9pt;mso-wrap-distance-bottom:0;mso-position-horizontal:right;mso-position-horizontal-relative:left-margin-area;mso-position-vertical:absolute;mso-position-vertical-relative:text;mso-width-percent:0;mso-height-percent:0;mso-width-relative:margin;mso-height-relative:margin;v-text-anchor:middle" arcsize="10923f" o:gfxdata="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" fillcolor="#4472c4 [3204]" strokecolor="#4472c4 [3204]" strokeweight="1pt">
+              <v:roundrect w14:anchorId="2D97E913" id="Rectangle: Rounded Corners 7" o:spid="_x0000_s1029" style="position:absolute;margin-left:-1.75pt;margin-top:127.75pt;width:49.45pt;height:67.6pt;z-index:251662336;visibility:visible;mso-wrap-style:square;mso-width-percent:0;mso-height-percent:0;mso-wrap-distance-left:9pt;mso-wrap-distance-top:0;mso-wrap-distance-right:9pt;mso-wrap-distance-bottom:0;mso-position-horizontal:right;mso-position-horizontal-relative:left-margin-area;mso-position-vertical:absolute;mso-position-vertical-relative:text;mso-width-percent:0;mso-height-percent:0;mso-width-relative:margin;mso-height-relative:margin;v-text-anchor:middle" arcsize="10923f" o:gfxdata="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" fillcolor="#4472c4 [3204]" strokecolor="#4472c4 [3204]" strokeweight="1pt">
                 <v:stroke joinstyle="miter"/>
                 <v:textbox>
                   <w:txbxContent>
@@ -1013,7 +1021,7 @@
         <mc:AlternateContent>
           <mc:Choice Requires="wps">
             <w:drawing>
-              <wp:anchor distT="0" distB="0" distL="114300" distR="114300" simplePos="0" relativeHeight="251661312" behindDoc="0" locked="0" layoutInCell="1" allowOverlap="1" wp14:anchorId="730D5282" wp14:editId="61234A73">
+              <wp:anchor distT="0" distB="0" distL="114300" distR="114300" simplePos="0" relativeHeight="251661312" behindDoc="0" locked="0" layoutInCell="1" allowOverlap="1" wp14:anchorId="0BF903B4" wp14:editId="6B0FC06B">
                 <wp:simplePos x="0" y="0"/>
                 <wp:positionH relativeFrom="column">
                   <wp:posOffset>-333956</wp:posOffset>
@@ -1071,7 +1079,7 @@
           </mc:Choice>
           <mc:Fallback>
             <w:pict>
-              <v:shape w14:anchorId="24EDED0B" id="Straight Arrow Connector 6" o:spid="_x0000_s1026" type="#_x0000_t32" style="position:absolute;margin-left:-26.3pt;margin-top:167.8pt;width:36.9pt;height:64.6pt;z-index:251661312;visibility:visible;mso-wrap-style:square;mso-width-percent:0;mso-height-percent:0;mso-wrap-distance-left:9pt;mso-wrap-distance-top:0;mso-wrap-distance-right:9pt;mso-wrap-distance-bottom:0;mso-position-horizontal:absolute;mso-position-horizontal-relative:text;mso-position-vertical:absolute;mso-position-vertical-relative:text;mso-width-percent:0;mso-height-percent:0;mso-width-relative:margin;mso-height-relative:margin" o:gfxdata="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" strokecolor="#4472c4 [3204]" strokeweight=".5pt">
+              <v:shape w14:anchorId="35ECA815" id="Straight Arrow Connector 6" o:spid="_x0000_s1026" type="#_x0000_t32" style="position:absolute;margin-left:-26.3pt;margin-top:167.8pt;width:36.9pt;height:64.6pt;z-index:251661312;visibility:visible;mso-wrap-style:square;mso-width-percent:0;mso-height-percent:0;mso-wrap-distance-left:9pt;mso-wrap-distance-top:0;mso-wrap-distance-right:9pt;mso-wrap-distance-bottom:0;mso-position-horizontal:absolute;mso-position-horizontal-relative:text;mso-position-vertical:absolute;mso-position-vertical-relative:text;mso-width-percent:0;mso-height-percent:0;mso-width-relative:margin;mso-height-relative:margin" o:gfxdata="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" strokecolor="#4472c4 [3204]" strokeweight=".5pt">
                 <v:stroke endarrow="block" joinstyle="miter"/>
               </v:shape>
             </w:pict>
@@ -1085,7 +1093,7 @@
         <mc:AlternateContent>
           <mc:Choice Requires="wps">
             <w:drawing>
-              <wp:anchor distT="0" distB="0" distL="114300" distR="114300" simplePos="0" relativeHeight="251659264" behindDoc="0" locked="0" layoutInCell="1" allowOverlap="1" wp14:anchorId="21EBF61F" wp14:editId="744DBCA7">
+              <wp:anchor distT="0" distB="0" distL="114300" distR="114300" simplePos="0" relativeHeight="251659264" behindDoc="0" locked="0" layoutInCell="1" allowOverlap="1" wp14:anchorId="5655B345" wp14:editId="30CB3536">
                 <wp:simplePos x="0" y="0"/>
                 <wp:positionH relativeFrom="column">
                   <wp:posOffset>-349857</wp:posOffset>
@@ -1143,7 +1151,7 @@
           </mc:Choice>
           <mc:Fallback>
             <w:pict>
-              <v:shape w14:anchorId="3000B283" id="Straight Arrow Connector 2" o:spid="_x0000_s1026" type="#_x0000_t32" style="position:absolute;margin-left:-27.55pt;margin-top:102.05pt;width:33.15pt;height:56.35pt;flip:y;z-index:251659264;visibility:visible;mso-wrap-style:square;mso-width-percent:0;mso-height-percent:0;mso-wrap-distance-left:9pt;mso-wrap-distance-top:0;mso-wrap-distance-right:9pt;mso-wrap-distance-bottom:0;mso-position-horizontal:absolute;mso-position-horizontal-relative:text;mso-position-vertical:absolute;mso-position-vertical-relative:text;mso-width-percent:0;mso-height-percent:0;mso-width-relative:margin;mso-height-relative:margin" o:gfxdata="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" strokecolor="#4472c4 [3204]" strokeweight=".5pt">
+              <v:shape w14:anchorId="3595B27C" id="Straight Arrow Connector 2" o:spid="_x0000_s1026" type="#_x0000_t32" style="position:absolute;margin-left:-27.55pt;margin-top:102.05pt;width:33.15pt;height:56.35pt;flip:y;z-index:251659264;visibility:visible;mso-wrap-style:square;mso-width-percent:0;mso-height-percent:0;mso-wrap-distance-left:9pt;mso-wrap-distance-top:0;mso-wrap-distance-right:9pt;mso-wrap-distance-bottom:0;mso-position-horizontal:absolute;mso-position-horizontal-relative:text;mso-position-vertical:absolute;mso-position-vertical-relative:text;mso-width-percent:0;mso-height-percent:0;mso-width-relative:margin;mso-height-relative:margin" o:gfxdata="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" strokecolor="#4472c4 [3204]" strokeweight=".5pt">
                 <v:stroke endarrow="block" joinstyle="miter"/>
               </v:shape>
             </w:pict>
@@ -1155,10 +1163,10 @@
           <w:noProof/>
         </w:rPr>
         <w:drawing>
-          <wp:inline distT="0" distB="0" distL="0" distR="0" wp14:anchorId="654B581D" wp14:editId="5177C7CD">
-            <wp:extent cx="5943600" cy="3977640"/>
-            <wp:effectExtent l="0" t="0" r="0" b="3810"/>
-            <wp:docPr id="1" name="Picture 1" descr="A screenshot of a computer&#10;&#10;Description automatically generated"/>
+          <wp:inline distT="0" distB="0" distL="0" distR="0" wp14:anchorId="7EC5159B" wp14:editId="69DAD5F7">
+            <wp:extent cx="5943600" cy="3948430"/>
+            <wp:effectExtent l="0" t="0" r="0" b="0"/>
+            <wp:docPr id="1842805831" name="Picture 1" descr="A screenshot of a computer&#10;&#10;AI-generated content may be incorrect."/>
             <wp:cNvGraphicFramePr>
               <a:graphicFrameLocks xmlns:a="http://schemas.openxmlformats.org/drawingml/2006/main" noChangeAspect="1"/>
             </wp:cNvGraphicFramePr>
@@ -1166,7 +1174,7 @@
               <a:graphicData uri="http://schemas.openxmlformats.org/drawingml/2006/picture">
                 <pic:pic xmlns:pic="http://schemas.openxmlformats.org/drawingml/2006/picture">
                   <pic:nvPicPr>
-                    <pic:cNvPr id="1" name="Picture 1" descr="A screenshot of a computer&#10;&#10;Description automatically generated"/>
+                    <pic:cNvPr id="1842805831" name="Picture 1" descr="A screenshot of a computer&#10;&#10;AI-generated content may be incorrect."/>
                     <pic:cNvPicPr/>
                   </pic:nvPicPr>
                   <pic:blipFill>
@@ -1178,7 +1186,7 @@
                   <pic:spPr>
                     <a:xfrm>
                       <a:off x="0" y="0"/>
-                      <a:ext cx="5943600" cy="3977640"/>
+                      <a:ext cx="5943600" cy="3948430"/>
                     </a:xfrm>
                     <a:prstGeom prst="rect">
                       <a:avLst/>
@@ -1199,7 +1207,7 @@
         <mc:AlternateContent>
           <mc:Choice Requires="wps">
             <w:drawing>
-              <wp:anchor distT="0" distB="0" distL="114300" distR="114300" simplePos="0" relativeHeight="251671552" behindDoc="0" locked="0" layoutInCell="1" allowOverlap="1" wp14:anchorId="50CC152E" wp14:editId="40556A0A">
+              <wp:anchor distT="0" distB="0" distL="114300" distR="114300" simplePos="0" relativeHeight="251671552" behindDoc="0" locked="0" layoutInCell="1" allowOverlap="1" wp14:anchorId="0B4F4BE9" wp14:editId="7C1FE1B0">
                 <wp:simplePos x="0" y="0"/>
                 <wp:positionH relativeFrom="leftMargin">
                   <wp:posOffset>3873086</wp:posOffset>
@@ -1289,7 +1297,7 @@
           </mc:Choice>
           <mc:Fallback>
             <w:pict>
-              <v:roundrect w14:anchorId="50CC152E" id="Rectangle: Rounded Corners 3" o:spid="_x0000_s1030" style="position:absolute;margin-left:304.95pt;margin-top:1.3pt;width:164.05pt;height:30.05pt;z-index:251671552;visibility:visible;mso-wrap-style:square;mso-width-percent:0;mso-height-percent:0;mso-wrap-distance-left:9pt;mso-wrap-distance-top:0;mso-wrap-distance-right:9pt;mso-wrap-distance-bottom:0;mso-position-horizontal:absolute;mso-position-horizontal-relative:left-margin-area;mso-position-vertical:absolute;mso-position-vertical-relative:text;mso-width-percent:0;mso-height-percent:0;mso-width-relative:margin;mso-height-relative:margin;v-text-anchor:middle" arcsize="10923f" o:gfxdata="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" fillcolor="#4472c4 [3204]" strokecolor="#4472c4 [3204]" strokeweight="1pt">
+              <v:roundrect w14:anchorId="0B4F4BE9" id="Rectangle: Rounded Corners 3" o:spid="_x0000_s1030" style="position:absolute;margin-left:304.95pt;margin-top:1.3pt;width:164.05pt;height:30.05pt;z-index:251671552;visibility:visible;mso-wrap-style:square;mso-width-percent:0;mso-height-percent:0;mso-wrap-distance-left:9pt;mso-wrap-distance-top:0;mso-wrap-distance-right:9pt;mso-wrap-distance-bottom:0;mso-position-horizontal:absolute;mso-position-horizontal-relative:left-margin-area;mso-position-vertical:absolute;mso-position-vertical-relative:text;mso-width-percent:0;mso-height-percent:0;mso-width-relative:margin;mso-height-relative:margin;v-text-anchor:middle" arcsize="10923f" o:gfxdata="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" fillcolor="#4472c4 [3204]" strokecolor="#4472c4 [3204]" strokeweight="1pt">
                 <v:stroke joinstyle="miter"/>
                 <v:textbox>
                   <w:txbxContent>
@@ -1324,7 +1332,7 @@
         <mc:AlternateContent>
           <mc:Choice Requires="wps">
             <w:drawing>
-              <wp:anchor distT="0" distB="0" distL="114300" distR="114300" simplePos="0" relativeHeight="251669504" behindDoc="0" locked="0" layoutInCell="1" allowOverlap="1" wp14:anchorId="27D1E3CA" wp14:editId="3A1C9446">
+              <wp:anchor distT="0" distB="0" distL="114300" distR="114300" simplePos="0" relativeHeight="251669504" behindDoc="0" locked="0" layoutInCell="1" allowOverlap="1" wp14:anchorId="6E22180B" wp14:editId="2D01489F">
                 <wp:simplePos x="0" y="0"/>
                 <wp:positionH relativeFrom="leftMargin">
                   <wp:posOffset>1399430</wp:posOffset>
@@ -1414,7 +1422,7 @@
           </mc:Choice>
           <mc:Fallback>
             <w:pict>
-              <v:roundrect w14:anchorId="27D1E3CA" id="Rectangle: Rounded Corners 17" o:spid="_x0000_s1031" style="position:absolute;margin-left:110.2pt;margin-top:.9pt;width:164.05pt;height:30.05pt;z-index:251669504;visibility:visible;mso-wrap-style:square;mso-width-percent:0;mso-height-percent:0;mso-wrap-distance-left:9pt;mso-wrap-distance-top:0;mso-wrap-distance-right:9pt;mso-wrap-distance-bottom:0;mso-position-horizontal:absolute;mso-position-horizontal-relative:left-margin-area;mso-position-vertical:absolute;mso-position-vertical-relative:text;mso-width-percent:0;mso-height-percent:0;mso-width-relative:margin;mso-height-relative:margin;v-text-anchor:middle" arcsize="10923f" o:gfxdata="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" fillcolor="#4472c4 [3204]" strokecolor="#4472c4 [3204]" strokeweight="1pt">
+              <v:roundrect w14:anchorId="6E22180B" id="Rectangle: Rounded Corners 17" o:spid="_x0000_s1031" style="position:absolute;margin-left:110.2pt;margin-top:.9pt;width:164.05pt;height:30.05pt;z-index:251669504;visibility:visible;mso-wrap-style:square;mso-width-percent:0;mso-height-percent:0;mso-wrap-distance-left:9pt;mso-wrap-distance-top:0;mso-wrap-distance-right:9pt;mso-wrap-distance-bottom:0;mso-position-horizontal:absolute;mso-position-horizontal-relative:left-margin-area;mso-position-vertical:absolute;mso-position-vertical-relative:text;mso-width-percent:0;mso-height-percent:0;mso-width-relative:margin;mso-height-relative:margin;v-text-anchor:middle" arcsize="10923f" o:gfxdata="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" fillcolor="#4472c4 [3204]" strokecolor="#4472c4 [3204]" strokeweight="1pt">
                 <v:stroke joinstyle="miter"/>
                 <v:textbox>
                   <w:txbxContent>
@@ -1470,18 +1478,41 @@
       </w:r>
       <w:proofErr w:type="gramEnd"/>
       <w:r>
-        <w:t xml:space="preserve"> field next to object export checkbox. All export XMLs are saved within a folder, which you will need to note down for import.</w:t>
-      </w:r>
-    </w:p>
-    <w:p>
-      <w:r>
-        <w:t xml:space="preserve">Once you run the export, you can manipulate exported documents as you need before you run the import using those files (example: you export all field definitions from Sandbox, but only need to import </w:t>
-      </w:r>
+        <w:t xml:space="preserve"> field next to </w:t>
+      </w:r>
+      <w:proofErr w:type="gramStart"/>
+      <w:r>
+        <w:t>object</w:t>
+      </w:r>
+      <w:proofErr w:type="gramEnd"/>
+      <w:r>
+        <w:t xml:space="preserve"> export checkbox. All export XMLs are saved within a folder, which you will need to note down for import.</w:t>
+      </w:r>
+    </w:p>
+    <w:p>
       <w:r>
         <w:lastRenderedPageBreak/>
-        <w:t xml:space="preserve">a couple. You would remove nodes from XML that are unnecessary before running the import). Import option in tool requires you to provide a path to folder where exported XMLs live. The importer will then use XML files from that folder for import. Note: if your import folder contains files for objects that you have not selected for import, those would be ignored.  </w:t>
-      </w:r>
-    </w:p>
+        <w:t xml:space="preserve">Once you run the export, you can manipulate exported documents as you need before you run the import using those files (example: you export all field definitions from </w:t>
+      </w:r>
+      <w:proofErr w:type="gramStart"/>
+      <w:r>
+        <w:t>Sandbox, but</w:t>
+      </w:r>
+      <w:proofErr w:type="gramEnd"/>
+      <w:r>
+        <w:t xml:space="preserve"> only need to import a couple. You would remove nodes from XML that are unnecessary before running the import). Import option in tool requires you to provide a path to folder where exported XMLs live. The importer will then use XML files from that folder for import. Note: if your import folder contains files for objects that you have not selected for import, those would be ignored.  </w:t>
+      </w:r>
+    </w:p>
+    <w:p/>
+    <w:p>
+      <w:pPr>
+        <w:pStyle w:val="Heading1"/>
+      </w:pPr>
+      <w:r>
+        <w:t>Running the tool</w:t>
+      </w:r>
+    </w:p>
+    <w:p/>
     <w:p>
       <w:r>
         <w:t xml:space="preserve">For running the tool, you will need </w:t>
@@ -1518,7 +1549,18 @@
         <w:spacing w:line="256" w:lineRule="auto"/>
       </w:pPr>
       <w:r>
-        <w:t>Username for the user who is running the import. For the import to be successful, that needs to be user with system administration privileges.</w:t>
+        <w:t xml:space="preserve">Client ID – generate client if not generated already, instructions are given here: </w:t>
+      </w:r>
+      <w:hyperlink r:id="rId6" w:anchor="oauth-20-flow---client-credentials" w:history="1">
+        <w:r>
+          <w:rPr>
+            <w:rStyle w:val="Hyperlink"/>
+          </w:rPr>
+          <w:t>https://developers.aprimo.com/docs/OAuth2#oauth-20-flow---client-credentials</w:t>
+        </w:r>
+      </w:hyperlink>
+      <w:r>
+        <w:t xml:space="preserve"> </w:t>
       </w:r>
     </w:p>
     <w:p>
@@ -1531,21 +1573,25 @@
         <w:spacing w:line="256" w:lineRule="auto"/>
       </w:pPr>
       <w:r>
-        <w:t>User Token – generate user token if not generated already, instructions are given here:</w:t>
+        <w:t>Client Secret from the client you created:</w:t>
       </w:r>
     </w:p>
     <w:p>
       <w:pPr>
         <w:pStyle w:val="ListParagraph"/>
-      </w:pPr>
-      <w:hyperlink r:id="rId6" w:history="1">
+        <w:spacing w:line="256" w:lineRule="auto"/>
+      </w:pPr>
+      <w:hyperlink r:id="rId7" w:anchor="oauth-20-flow---client-credentials" w:history="1">
         <w:r>
           <w:rPr>
             <w:rStyle w:val="Hyperlink"/>
           </w:rPr>
-          <w:t>https://developers.aprimo.com/marketing-operations/rest-api/authorization/</w:t>
+          <w:t>https://developers.aprimo.com/docs/OAuth2#oauth-20-flow---client-credentials</w:t>
         </w:r>
       </w:hyperlink>
+      <w:r>
+        <w:t xml:space="preserve"> </w:t>
+      </w:r>
     </w:p>
     <w:p>
       <w:pPr>
@@ -1557,16 +1603,16 @@
         <w:spacing w:line="256" w:lineRule="auto"/>
       </w:pPr>
       <w:r>
-        <w:t xml:space="preserve">Client ID – generate client if not generated already, instructions are given here: </w:t>
-      </w:r>
-      <w:hyperlink r:id="rId7" w:history="1">
-        <w:r>
-          <w:rPr>
-            <w:rStyle w:val="Hyperlink"/>
-          </w:rPr>
-          <w:t>https://developers.aprimo.com/marketing-operations/rest-api/authorization/</w:t>
-        </w:r>
-      </w:hyperlink>
+        <w:t>Path to folder containing exported XMLs for running imports</w:t>
+      </w:r>
+    </w:p>
+    <w:p>
+      <w:pPr>
+        <w:spacing w:line="256" w:lineRule="auto"/>
+      </w:pPr>
+      <w:r>
+        <w:t>When creating the Registration to obtain the Client ID, make sure to:</w:t>
+      </w:r>
     </w:p>
     <w:p>
       <w:pPr>
@@ -1578,20 +1624,87 @@
         <w:spacing w:line="256" w:lineRule="auto"/>
       </w:pPr>
       <w:r>
-        <w:t>Path to folder containing exported XMLs for running imports</w:t>
-      </w:r>
-    </w:p>
-    <w:p>
+        <w:t xml:space="preserve">Select </w:t>
+      </w:r>
+      <w:r>
+        <w:t>OAuth Flow Type to </w:t>
+      </w:r>
+      <w:r>
+        <w:rPr>
+          <w:b/>
+          <w:bCs/>
+        </w:rPr>
+        <w:t>Client Credentials</w:t>
+      </w:r>
+    </w:p>
+    <w:p>
+      <w:pPr>
+        <w:pStyle w:val="ListParagraph"/>
+        <w:numPr>
+          <w:ilvl w:val="0"/>
+          <w:numId w:val="7"/>
+        </w:numPr>
+        <w:spacing w:line="256" w:lineRule="auto"/>
+      </w:pPr>
+      <w:r>
+        <w:t>Set User to be an admin account</w:t>
+      </w:r>
+      <w:r>
+        <w:t xml:space="preserve"> to make sure the tool will have access to setup configurations </w:t>
+      </w:r>
+    </w:p>
+    <w:p>
+      <w:pPr>
+        <w:pStyle w:val="ListParagraph"/>
+        <w:numPr>
+          <w:ilvl w:val="0"/>
+          <w:numId w:val="7"/>
+        </w:numPr>
+        <w:spacing w:line="256" w:lineRule="auto"/>
+      </w:pPr>
+      <w:r>
+        <w:t xml:space="preserve">You can </w:t>
+      </w:r>
       <w:proofErr w:type="gramStart"/>
       <w:r>
+        <w:t>setup</w:t>
+      </w:r>
+      <w:proofErr w:type="gramEnd"/>
+      <w:r>
+        <w:t xml:space="preserve"> </w:t>
+      </w:r>
+      <w:r>
+        <w:t>Access Token Lifetime</w:t>
+      </w:r>
+      <w:r>
+        <w:t xml:space="preserve"> to be high, to make sure the token generated lasts longer.</w:t>
+      </w:r>
+    </w:p>
+    <w:p>
+      <w:pPr>
+        <w:pStyle w:val="ListParagraph"/>
+        <w:spacing w:line="256" w:lineRule="auto"/>
+      </w:pPr>
+    </w:p>
+    <w:p>
+      <w:proofErr w:type="gramStart"/>
+      <w:r>
         <w:t>Tool</w:t>
       </w:r>
       <w:proofErr w:type="gramEnd"/>
       <w:r>
-        <w:t xml:space="preserve"> will show you progress via progress bar and logs. Logs can be saved in a text file using “Save Log </w:t>
+        <w:t xml:space="preserve"> will show you progress via progress </w:t>
       </w:r>
       <w:proofErr w:type="gramStart"/>
       <w:r>
+        <w:t>bar</w:t>
+      </w:r>
+      <w:proofErr w:type="gramEnd"/>
+      <w:r>
+        <w:t xml:space="preserve"> and logs. Logs can be saved in a text file using “Save Log </w:t>
+      </w:r>
+      <w:proofErr w:type="gramStart"/>
+      <w:r>
         <w:t>To</w:t>
       </w:r>
       <w:proofErr w:type="gramEnd"/>
@@ -1601,34 +1714,13 @@
     </w:p>
     <w:p>
       <w:r>
-        <w:t xml:space="preserve">To help you with providing </w:t>
-      </w:r>
-      <w:proofErr w:type="gramStart"/>
-      <w:r>
-        <w:t>environment</w:t>
-      </w:r>
-      <w:proofErr w:type="gramEnd"/>
-      <w:r>
-        <w:t xml:space="preserve"> details, the tool offers option to save (locally) all provide environment details and use them </w:t>
-      </w:r>
-      <w:proofErr w:type="gramStart"/>
-      <w:r>
-        <w:t>at a later time</w:t>
-      </w:r>
-      <w:proofErr w:type="gramEnd"/>
-      <w:r>
-        <w:t>. For this purpose, tool will create “Connection Details.xml” in the deploy directory as you start saving your environment details, so do not remove this file if you want to be able to reuse authentication details in the future.</w:t>
-      </w:r>
-    </w:p>
-    <w:p>
-      <w:r>
         <w:t>There is a button to reset destination environment to default configuration in the bottom left corner. If you choose this option, all field groups, field definitions and classifications will be removed from destination environment, so please use this option with extreme caution. Once the button is clicked it will ask you to confirm the cleanup via warning message.</w:t>
       </w:r>
     </w:p>
     <w:p/>
     <w:p>
       <w:pPr>
-        <w:pStyle w:val="Title"/>
+        <w:pStyle w:val="Heading1"/>
       </w:pPr>
       <w:r>
         <w:t>DAM configuration items covered by Configuration mover</w:t>
@@ -1637,7 +1729,7 @@
     <w:p/>
     <w:p>
       <w:pPr>
-        <w:pStyle w:val="Heading1"/>
+        <w:pStyle w:val="Heading2"/>
       </w:pPr>
       <w:r>
         <w:t>Field groups</w:t>
@@ -1674,6 +1766,7 @@
         <w:t xml:space="preserve">for field groups that are controlling views/panels you would need to </w:t>
       </w:r>
       <w:r>
+        <w:lastRenderedPageBreak/>
         <w:t xml:space="preserve">manually </w:t>
       </w:r>
       <w:r>
@@ -1685,10 +1778,9 @@
     </w:p>
     <w:p>
       <w:pPr>
-        <w:pStyle w:val="Heading1"/>
-      </w:pPr>
-      <w:r>
-        <w:lastRenderedPageBreak/>
+        <w:pStyle w:val="Heading2"/>
+      </w:pPr>
+      <w:r>
         <w:t xml:space="preserve">Field definitions </w:t>
       </w:r>
     </w:p>
@@ -1793,7 +1885,7 @@
         </w:numPr>
       </w:pPr>
       <w:r>
-        <w:t>NOT TESTED field types: Duration, Language List, User Group list, Record List, Record Link, Time – these are all implemented to cover import/export of all custom field parameters, but I haven’t had a chance to test.</w:t>
+        <w:t>NOT TESTED field types: Duration, Language List, User Group list, Record List, Time – these are all implemented to cover import/export of all custom field parameters, but I haven’t had a chance to test.</w:t>
       </w:r>
     </w:p>
     <w:p>
@@ -1817,78 +1909,70 @@
         </w:numPr>
       </w:pPr>
       <w:r>
-        <w:t xml:space="preserve">Watch for errors and warning within logs, warning messages might pop up to let you know certain </w:t>
+        <w:t>Watch for errors and warning within logs, warning messages might pop up to let you know certain piece of configuration wasn’t moved because of dependency missing (examples: if you’re moving classification list field but there’s no appropriate root classification on destination environment, the root classification would be set by default to top level, and you’ll get a warning from tool. Also, if you’re trying to copy a label in a language that doesn’t exist on destination, the move of field definition will proceed but will warn you that a label in an inexistent language was not set.) These kinds of warnings/missing of dependencies are considered non-critical for copying the configuration over, therefore the tool will create an object on destination. If you provide that dependency and run the tool again, the definition will be updated as expected. However, the tool won’t create a field definition without a critical piece of configuration that would then require you to delete the definition and recreate it (example: classification list field won’t be created without properly checking the box “Link records to the selected classifications” if it was checked on source environment).</w:t>
+      </w:r>
+    </w:p>
+    <w:p>
+      <w:pPr>
+        <w:pStyle w:val="Heading2"/>
+      </w:pPr>
+      <w:r>
+        <w:t>Classifications</w:t>
+      </w:r>
+    </w:p>
+    <w:p>
+      <w:r>
+        <w:t xml:space="preserve">Tool copies all classification configuration except for images – adding image via REST API to classification is not supported. </w:t>
       </w:r>
       <w:proofErr w:type="gramStart"/>
       <w:r>
-        <w:t>piece</w:t>
+        <w:t>In order for</w:t>
       </w:r>
       <w:proofErr w:type="gramEnd"/>
       <w:r>
-        <w:t xml:space="preserve"> of configuration wasn’t moved because of dependency missing (examples: if you’re moving classification list field but there’s no appropriate root classification on destination environment, the root classification would be set by default to top level, and you’ll get a warning from tool. Also, if you’re trying to copy a label in a language that doesn’t exist on destination, the move of field definition will proceed but will warn you that a label in an inexistent language was not set.) These kinds of warnings/missing of dependencies are considered non-critical for copying the configuration over, therefore the tool will create an object on destination. If you provide that dependency and run the tool again, the definition will be updated as expected. However, the tool won’t create a field definition without a critical piece of configuration that would then require you to delete the definition and recreate it (example: classification list field won’t be created without properly checking the box “Link records to the selected classifications” if it was checked on source environment).</w:t>
-      </w:r>
-    </w:p>
-    <w:p>
-      <w:pPr>
-        <w:pStyle w:val="Heading1"/>
-      </w:pPr>
-      <w:r>
-        <w:t>Classifications</w:t>
-      </w:r>
-    </w:p>
-    <w:p>
-      <w:r>
-        <w:t xml:space="preserve">Tool copies all classification configuration except for images – adding image via REST API to classification is not supported. </w:t>
+        <w:t xml:space="preserve"> fields/field groups to be registered and appropriate values to be filled in on classifications, those objects need to exist on destination, otherwise tool will report warning and skip this part of configuration for classification. </w:t>
+      </w:r>
+    </w:p>
+    <w:p>
+      <w:pPr>
+        <w:pStyle w:val="Heading2"/>
+      </w:pPr>
+      <w:r>
+        <w:t>Content Types</w:t>
+      </w:r>
+    </w:p>
+    <w:p>
+      <w:r>
+        <w:t xml:space="preserve">Tool copies all content </w:t>
       </w:r>
       <w:proofErr w:type="gramStart"/>
       <w:r>
-        <w:t>In order for</w:t>
+        <w:t>types</w:t>
       </w:r>
       <w:proofErr w:type="gramEnd"/>
       <w:r>
-        <w:t xml:space="preserve"> fields/field groups to be registered and appropriate values to be filled in on classifications, those objects need to exist on destination, otherwise tool will report warning and skip this part of configuration for classification. </w:t>
-      </w:r>
-    </w:p>
-    <w:p>
-      <w:pPr>
-        <w:pStyle w:val="Heading1"/>
-      </w:pPr>
-      <w:r>
-        <w:t>Content Types</w:t>
-      </w:r>
-    </w:p>
-    <w:p>
-      <w:r>
-        <w:t xml:space="preserve">Tool copies all content </w:t>
+        <w:t xml:space="preserve"> configuration to destination environment, it can be used to create or update Content Types based on setup/export in source environment. The only known issue is when trying to remove inherited field definitions from a Content Type while updating a Content Type. The tool will throw </w:t>
       </w:r>
       <w:proofErr w:type="gramStart"/>
       <w:r>
-        <w:t>types</w:t>
+        <w:t>and</w:t>
       </w:r>
       <w:proofErr w:type="gramEnd"/>
       <w:r>
-        <w:t xml:space="preserve"> configuration to destination environment, it can be used to create or update Content Types based on setup/export in source environment. The only known issue is when trying to remove inherited field definitions from a Content Type while updating a Content Type. The tool will throw </w:t>
+        <w:t xml:space="preserve"> exception in this </w:t>
       </w:r>
       <w:proofErr w:type="gramStart"/>
       <w:r>
-        <w:t>and</w:t>
+        <w:t>particular case</w:t>
       </w:r>
       <w:proofErr w:type="gramEnd"/>
       <w:r>
-        <w:t xml:space="preserve"> exception in this </w:t>
-      </w:r>
-      <w:proofErr w:type="gramStart"/>
-      <w:r>
-        <w:t>particular case</w:t>
-      </w:r>
-      <w:proofErr w:type="gramEnd"/>
-      <w:r>
         <w:t xml:space="preserve">. </w:t>
       </w:r>
     </w:p>
     <w:p>
       <w:pPr>
-        <w:pStyle w:val="Heading1"/>
+        <w:pStyle w:val="Heading2"/>
       </w:pPr>
       <w:r>
         <w:lastRenderedPageBreak/>
@@ -1910,7 +1994,7 @@
     </w:p>
     <w:p>
       <w:pPr>
-        <w:pStyle w:val="Heading1"/>
+        <w:pStyle w:val="Heading2"/>
       </w:pPr>
       <w:r>
         <w:t>Setting Categories</w:t>
@@ -1918,20 +2002,12 @@
     </w:p>
     <w:p>
       <w:r>
-        <w:t xml:space="preserve">Mover copies setting categories only, using category </w:t>
-      </w:r>
-      <w:proofErr w:type="gramStart"/>
-      <w:r>
-        <w:t>name</w:t>
-      </w:r>
-      <w:proofErr w:type="gramEnd"/>
-      <w:r>
-        <w:t xml:space="preserve"> as identifier. If setting category exists at destination (with same name) mover will skip it. Intended for custom setting categories.</w:t>
-      </w:r>
-    </w:p>
-    <w:p>
-      <w:pPr>
-        <w:pStyle w:val="Heading1"/>
+        <w:t>Mover copies setting categories only, using category name as identifier. If setting category exists at destination (with same name) mover will skip it. Intended for custom setting categories.</w:t>
+      </w:r>
+    </w:p>
+    <w:p>
+      <w:pPr>
+        <w:pStyle w:val="Heading2"/>
       </w:pPr>
       <w:r>
         <w:t>Setting Definitions</w:t>
@@ -1987,7 +2063,7 @@
     </w:p>
     <w:p>
       <w:pPr>
-        <w:pStyle w:val="Heading1"/>
+        <w:pStyle w:val="Heading2"/>
       </w:pPr>
       <w:r>
         <w:t>Setting Values</w:t>
@@ -2047,7 +2123,7 @@
     </w:p>
     <w:p>
       <w:pPr>
-        <w:pStyle w:val="Heading1"/>
+        <w:pStyle w:val="Heading2"/>
       </w:pPr>
       <w:r>
         <w:t>Rules</w:t>
@@ -2122,7 +2198,6 @@
           <w:i/>
           <w:iCs/>
         </w:rPr>
-        <w:lastRenderedPageBreak/>
         <w:t xml:space="preserve">Import items in </w:t>
       </w:r>
       <w:proofErr w:type="gramStart"/>
@@ -2170,6 +2245,7 @@
         </w:numPr>
       </w:pPr>
       <w:r>
+        <w:lastRenderedPageBreak/>
         <w:t xml:space="preserve">Classifications – the tool will not fail if field definitions are missing, it will just ignore missing fields to register and issue a warning; we will need classifications created first for Classification List field definitions to be added </w:t>
       </w:r>
     </w:p>
@@ -2309,17 +2385,20 @@
         <w:t>registeredFacets</w:t>
       </w:r>
       <w:proofErr w:type="spellEnd"/>
+      <w:r>
+        <w:t>, .</w:t>
+      </w:r>
+      <w:proofErr w:type="spellStart"/>
+      <w:r>
+        <w:t>assetStudioRegisteredSpaces</w:t>
+      </w:r>
+      <w:proofErr w:type="spellEnd"/>
+      <w:r>
+        <w:t>)  setting</w:t>
+      </w:r>
       <w:proofErr w:type="gramEnd"/>
       <w:r>
-        <w:t>, .</w:t>
-      </w:r>
-      <w:proofErr w:type="spellStart"/>
-      <w:r>
-        <w:t>assetStudioRegisteredSpaces</w:t>
-      </w:r>
-      <w:proofErr w:type="spellEnd"/>
-      <w:r>
-        <w:t xml:space="preserve">)  setting values that are copied refer to environment specific object identifiers (field definition GUIDs or classification GUIDs). </w:t>
+        <w:t xml:space="preserve"> values that are copied refer to environment specific object identifiers (field definition GUIDs or classification GUIDs). </w:t>
       </w:r>
       <w:proofErr w:type="gramStart"/>
       <w:r>
@@ -2327,7 +2406,15 @@
       </w:r>
       <w:proofErr w:type="gramEnd"/>
       <w:r>
-        <w:t xml:space="preserve"> after the import is finished please go to the setup of spaces for Asset Studio under Quick Start Guides and/or setup for facets and correct the identifiers (provide adequate field definitions and/or classifications for facets and spaces).</w:t>
+        <w:t xml:space="preserve"> after the import is </w:t>
+      </w:r>
+      <w:proofErr w:type="gramStart"/>
+      <w:r>
+        <w:t>finished</w:t>
+      </w:r>
+      <w:proofErr w:type="gramEnd"/>
+      <w:r>
+        <w:t xml:space="preserve"> please go to the setup of spaces for Asset Studio under Quick Start Guides and/or setup for facets and correct the identifiers (provide adequate field definitions and/or classifications for facets and spaces).</w:t>
       </w:r>
     </w:p>
     <w:p>
@@ -3815,7 +3902,6 @@
     <w:name w:val="Hyperlink"/>
     <w:basedOn w:val="DefaultParagraphFont"/>
     <w:uiPriority w:val="99"/>
-    <w:semiHidden/>
     <w:unhideWhenUsed/>
     <w:rsid w:val="00480484"/>
     <w:rPr>

</xml_diff>